<commit_message>
Add Grade 11 starter file and guide, rewrite planning sheet plainly
PROMPT_STARTER.psd keeps the finished layout but leaves the photo
untouched: the mouth is still there, there is no colour grade, and the
bar is flat. The student removes the mouth, adds the Curves and Gradient
Map adjustment layers, and applies Displace in Photoshop themselves, so
the file really contains those layers and the process screenshots are
their own.

The guide covers those steps in plain language, with screenshot prompts
and a short 'if your teacher asks' section. Add Noise is marked optional
as a retoucher habit rather than a Grade 11 step.

The planning sheet is rewritten in plain first-person language and now
only describes steps the student performs.

Co-Authored-By: Claude Opus 5.5 <noreply@anthropic.com>
Claude-Session: https://claude.ai/code/session_01MJBkono5h2ZQhPNMyZWo68
</commit_message>
<xml_diff>
--- a/out/PROMPT_planning_sheet.docx
+++ b/out/PROMPT_planning_sheet.docx
@@ -33,7 +33,6 @@
         <w:rPr>
           <w:b/>
           <w:color w:val="2E5B2E"/>
-          <w:sz w:val="23"/>
         </w:rPr>
         <w:t>1. What type of magazine cover are you creating?</w:t>
       </w:r>
@@ -43,7 +42,7 @@
         <w:ind w:left="360"/>
       </w:pPr>
       <w:r>
-        <w:t>Technology / AI. PROMPT is a serious ideas-and-current-affairs magazine about technology and what it is doing to people — closer to WIRED or TIME than to a gadget review magazine.</w:t>
+        <w:t>Technology / AI. My magazine is about how technology is changing the way people live and talk to each other.</w:t>
       </w:r>
     </w:p>
     <w:p>
@@ -54,7 +53,6 @@
         <w:rPr>
           <w:b/>
           <w:color w:val="2E5B2E"/>
-          <w:sz w:val="23"/>
         </w:rPr>
         <w:t>2. What is the name of your magazine?</w:t>
       </w:r>
@@ -64,7 +62,7 @@
         <w:ind w:left="360"/>
       </w:pPr>
       <w:r>
-        <w:t>PROMPT — the word means both a cue that helps a person speak, and the instruction you type into an AI. The whole cover lives inside that double meaning.</w:t>
+        <w:t>PROMPT. A prompt is what you type into an AI, but it also means helping someone start talking. I liked that it has both meanings.</w:t>
       </w:r>
     </w:p>
     <w:p>
@@ -75,7 +73,6 @@
         <w:rPr>
           <w:b/>
           <w:color w:val="2E5B2E"/>
-          <w:sz w:val="23"/>
         </w:rPr>
         <w:t>3. In one sentence, what is the main message of your magazine cover (what is the main cover line)?</w:t>
       </w:r>
@@ -85,7 +82,7 @@
         <w:ind w:left="360"/>
       </w:pPr>
       <w:r>
-        <w:t>Main cover line: "FINISH MY SENTENCE." — we are handing our own voice over to machines that predict what we were about to say.</w:t>
+        <w:t>"FINISH MY SENTENCE." - we are letting AI finish our sentences for us, so we are losing our own voice.</w:t>
       </w:r>
     </w:p>
     <w:p>
@@ -96,7 +93,6 @@
         <w:rPr>
           <w:b/>
           <w:color w:val="2E5B2E"/>
-          <w:sz w:val="23"/>
         </w:rPr>
         <w:t>4a. What is your central image going to look like?</w:t>
       </w:r>
@@ -106,7 +102,7 @@
         <w:ind w:left="360"/>
       </w:pPr>
       <w:r>
-        <w:t>A black-and-white studio portrait, head and shoulders, looking straight down the lens on a plain backdrop. The mouth has been digitally removed — smooth skin where it should be. Wrapped across the lower face, exactly where the mouth was, is the predictive-text suggestion bar from a phone keyboard, reading "I'm | fine | thanks", with the middle word already highlighted as though the machine has chosen for her.</w:t>
+        <w:t>A black and white photo of a woman looking straight at the camera. Her mouth is removed so there is just skin there. Where her mouth used to be, I will put the word suggestion bar from a phone keyboard. It will say "I'm | fine | thanks", with "fine" highlighted in green like the phone already picked it for her.</w:t>
       </w:r>
     </w:p>
     <w:p>
@@ -117,7 +113,6 @@
         <w:rPr>
           <w:b/>
           <w:color w:val="2E5B2E"/>
-          <w:sz w:val="23"/>
         </w:rPr>
         <w:t>4b. How are you going to manipulate the image? Be detailed.</w:t>
       </w:r>
@@ -127,7 +122,7 @@
         <w:pStyle w:val="ListBullet"/>
       </w:pPr>
       <w:r>
-        <w:t>Remove the mouth using the Spot Healing Brush and Clone Stamp, sampling clean skin from the forehead and cheek.</w:t>
+        <w:t>Remove the mouth: select it with the Lasso tool, use Content-Aware Fill, then clean it up with the Spot Healing Brush and Clone Stamp.</w:t>
       </w:r>
     </w:p>
     <w:p>
@@ -135,7 +130,7 @@
         <w:pStyle w:val="ListBullet"/>
       </w:pPr>
       <w:r>
-        <w:t>Rebuild believable skin texture over the healed patch by adding fine grain, so the area does not look plastic or blurred.</w:t>
+        <w:t>Make the grey background almost black with a Curves adjustment layer.</w:t>
       </w:r>
     </w:p>
     <w:p>
@@ -143,7 +138,7 @@
         <w:pStyle w:val="ListBullet"/>
       </w:pPr>
       <w:r>
-        <w:t>Curves adjustment layer to crush the grey backdrop to near-black while holding the highlights on the face.</w:t>
+        <w:t>Turn the photo dark blue with a Gradient Map adjustment layer.</w:t>
       </w:r>
     </w:p>
     <w:p>
@@ -151,7 +146,7 @@
         <w:pStyle w:val="ListBullet"/>
       </w:pPr>
       <w:r>
-        <w:t>Gradient Map adjustment layer for a cold blue-steel duotone (colourisation).</w:t>
+        <w:t>Make the suggestion bar with the Rounded Rectangle tool and the Type tool, and give it a drop shadow.</w:t>
       </w:r>
     </w:p>
     <w:p>
@@ -159,7 +154,7 @@
         <w:pStyle w:val="ListBullet"/>
       </w:pPr>
       <w:r>
-        <w:t>Radial vignette to pull the eye to the centre of the face.</w:t>
+        <w:t>New skill: use the Displace filter so the bar bends around her face and looks like it is on her skin. I will learn this from a YouTube tutorial.</w:t>
       </w:r>
     </w:p>
     <w:p>
@@ -167,31 +162,7 @@
         <w:pStyle w:val="ListBullet"/>
       </w:pPr>
       <w:r>
-        <w:t>Build the suggestion bar from rounded-rectangle shape layers and live type.</w:t>
-      </w:r>
-    </w:p>
-    <w:p>
-      <w:pPr>
-        <w:pStyle w:val="ListBullet"/>
-      </w:pPr>
-      <w:r>
-        <w:t>NEW SKILL: Filter &gt; Distort &gt; Displace, using a blurred greyscale copy of the face saved as its own .psd as the displacement map, so the bar bends over the cheeks and jaw instead of sitting flat on top like a sticker.</w:t>
-      </w:r>
-    </w:p>
-    <w:p>
-      <w:pPr>
-        <w:pStyle w:val="ListBullet"/>
-      </w:pPr>
-      <w:r>
-        <w:t>Multiply-blended shading layer so the bar picks up the same light as the face, plus a soft drop shadow underneath so it sits on the skin.</w:t>
-      </w:r>
-    </w:p>
-    <w:p>
-      <w:pPr>
-        <w:pStyle w:val="ListBullet"/>
-      </w:pPr>
-      <w:r>
-        <w:t>Linear gradient scrim across the foot of the cover so the bottom type stays readable over the lit neck.</w:t>
+        <w:t>Use downloaded fonts: Manrope and Roboto from Google Fonts.</w:t>
       </w:r>
     </w:p>
     <w:p>
@@ -202,7 +173,6 @@
         <w:rPr>
           <w:b/>
           <w:color w:val="2E5B2E"/>
-          <w:sz w:val="23"/>
         </w:rPr>
         <w:t>4c. How is this manipulation enhancing or helping you convey the message?</w:t>
       </w:r>
@@ -212,7 +182,7 @@
         <w:ind w:left="360"/>
       </w:pPr>
       <w:r>
-        <w:t>Deleting the mouth makes the idea literal instead of symbolic — you cannot argue with a face that has no mouth. Putting the keyboard suggestion bar exactly where the mouth used to be says the machine is doing the talking now. The words matter: "I'm fine thanks" is the most auto-completed and least honest sentence in English, and highlighting the middle word shows the choice has already been made for her. The cold blue duotone keeps the whole thing clinical and unfriendly, and the single acid-green accent is the only machine-made colour on the page — it appears on the bar, the kickers, the rule and the cover line, which walks the reader's eye from the masthead down through the face to "SENTENCE."</w:t>
+        <w:t>Taking away her mouth shows she can't speak for herself anymore. Putting the keyboard bar where her mouth should be shows the phone is talking for her. I chose "I'm fine thanks" because people say it automatically even when it isn't true. The dark blue makes it feel cold and robotic. The green is the only bright colour, so your eye goes to the bar first and then down to "SENTENCE."</w:t>
       </w:r>
     </w:p>
     <w:p>
@@ -223,7 +193,6 @@
         <w:rPr>
           <w:b/>
           <w:color w:val="2E5B2E"/>
-          <w:sz w:val="23"/>
         </w:rPr>
         <w:t>5. Did Ms. Bensusan discuss your idea with you and give you feedback?</w:t>
       </w:r>
@@ -233,7 +202,7 @@
         <w:ind w:left="360"/>
       </w:pPr>
       <w:r>
-        <w:t>[ YOUR ANSWER HERE — show her the concept before you submit, then write down what she said and anything you changed because of it. ]</w:t>
+        <w:t>[ Write what Ms. Bensusan said here, and anything you changed because of it. ]</w:t>
       </w:r>
     </w:p>
     <w:p>
@@ -250,7 +219,7 @@
           <w:b/>
           <w:sz w:val="28"/>
         </w:rPr>
-        <w:t>DESIGN ELEMENTS AND PRINCIPLES USED</w:t>
+        <w:t>ELEMENTS AND PRINCIPLES OF DESIGN</w:t>
       </w:r>
     </w:p>
     <w:p>
@@ -261,7 +230,6 @@
         <w:rPr>
           <w:b/>
           <w:color w:val="2E5B2E"/>
-          <w:sz w:val="23"/>
         </w:rPr>
         <w:t>Elements of Design</w:t>
       </w:r>
@@ -271,7 +239,7 @@
         <w:pStyle w:val="ListBullet"/>
       </w:pPr>
       <w:r>
-        <w:t>Line — the acid rule under the masthead and the dividers inside the bar.</w:t>
+        <w:t>Line - the green line under the title, and the lines between the words in the bar.</w:t>
       </w:r>
     </w:p>
     <w:p>
@@ -279,7 +247,7 @@
         <w:pStyle w:val="ListBullet"/>
       </w:pPr>
       <w:r>
-        <w:t>Shape — the rounded rectangles of the suggestion bar and the barcode block.</w:t>
+        <w:t>Shape - the rounded rectangle bar and the barcode.</w:t>
       </w:r>
     </w:p>
     <w:p>
@@ -287,7 +255,7 @@
         <w:pStyle w:val="ListBullet"/>
       </w:pPr>
       <w:r>
-        <w:t>Value — hard chiaroscuro: a lit face against a near-black ground.</w:t>
+        <w:t>Value - a bright face on a very dark background.</w:t>
       </w:r>
     </w:p>
     <w:p>
@@ -295,7 +263,7 @@
         <w:pStyle w:val="ListBullet"/>
       </w:pPr>
       <w:r>
-        <w:t>Colour — cold blue-steel duotone with one acid-green accent.</w:t>
+        <w:t>Colour - dark blue with one bright green.</w:t>
       </w:r>
     </w:p>
     <w:p>
@@ -303,7 +271,7 @@
         <w:pStyle w:val="ListBullet"/>
       </w:pPr>
       <w:r>
-        <w:t>Texture — rebuilt skin grain across the healed area and film grain overall.</w:t>
+        <w:t>Texture - the skin texture on her face.</w:t>
       </w:r>
     </w:p>
     <w:p>
@@ -311,7 +279,7 @@
         <w:pStyle w:val="ListBullet"/>
       </w:pPr>
       <w:r>
-        <w:t>Space — deliberate negative space either side of the head holds the cover lines.</w:t>
+        <w:t>Space - empty dark space on each side of her head for the cover lines.</w:t>
       </w:r>
     </w:p>
     <w:p>
@@ -319,7 +287,7 @@
         <w:pStyle w:val="ListBullet"/>
       </w:pPr>
       <w:r>
-        <w:t>Form — the modelling on the face keeps it three-dimensional under the flat UI bar.</w:t>
+        <w:t>Form - her face still looks 3D because of the shadows.</w:t>
       </w:r>
     </w:p>
     <w:p>
@@ -330,7 +298,6 @@
         <w:rPr>
           <w:b/>
           <w:color w:val="2E5B2E"/>
-          <w:sz w:val="23"/>
         </w:rPr>
         <w:t>Principles of Design</w:t>
       </w:r>
@@ -340,7 +307,7 @@
         <w:pStyle w:val="ListBullet"/>
       </w:pPr>
       <w:r>
-        <w:t>Balance — a symmetrical, centred portrait deliberately unbalanced by asymmetric type down the left.</w:t>
+        <w:t>Balance - her face is in the centre, with text on both sides.</w:t>
       </w:r>
     </w:p>
     <w:p>
@@ -348,7 +315,7 @@
         <w:pStyle w:val="ListBullet"/>
       </w:pPr>
       <w:r>
-        <w:t>Contrast — light face against dark ground; warm acid green against cold blue.</w:t>
+        <w:t>Contrast - bright face against a dark background, and green against blue.</w:t>
       </w:r>
     </w:p>
     <w:p>
@@ -356,7 +323,7 @@
         <w:pStyle w:val="ListBullet"/>
       </w:pPr>
       <w:r>
-        <w:t>Emphasis — the suggestion bar is the brightest, most saturated thing on the cover, sitting dead centre.</w:t>
+        <w:t>Emphasis - the green bar in the middle is the first thing you notice.</w:t>
       </w:r>
     </w:p>
     <w:p>
@@ -364,7 +331,7 @@
         <w:pStyle w:val="ListBullet"/>
       </w:pPr>
       <w:r>
-        <w:t>Movement — the eye travels masthead, down the face, onto the bar, down to the main cover line.</w:t>
+        <w:t>Movement - your eye goes from the title, down her face, to the bar, then to "FINISH MY SENTENCE."</w:t>
       </w:r>
     </w:p>
     <w:p>
@@ -372,7 +339,7 @@
         <w:pStyle w:val="ListBullet"/>
       </w:pPr>
       <w:r>
-        <w:t>Repetition — acid green recurs four times; every cover line uses the same kicker-over-headline structure.</w:t>
+        <w:t>Repetition - I used the same green on the small headings, the line, the bar and "SENTENCE."</w:t>
       </w:r>
     </w:p>
     <w:p>
@@ -380,7 +347,7 @@
         <w:pStyle w:val="ListBullet"/>
       </w:pPr>
       <w:r>
-        <w:t>Unity — two type families only (Manrope and Roboto) and one palette across the whole cover.</w:t>
+        <w:t>Unity - I only used two fonts and the same colours everywhere.</w:t>
       </w:r>
     </w:p>
     <w:p>
@@ -388,7 +355,7 @@
         <w:pStyle w:val="ListBullet"/>
       </w:pPr>
       <w:r>
-        <w:t>Rhythm — the stacked three-line cover-line blocks set a steady beat down the left edge.</w:t>
+        <w:t>Rhythm - the three small cover lines are all set up the same way.</w:t>
       </w:r>
     </w:p>
     <w:p>
@@ -399,9 +366,8 @@
         <w:rPr>
           <w:b/>
           <w:color w:val="2E5B2E"/>
-          <w:sz w:val="23"/>
         </w:rPr>
-        <w:t>Technical checklist</w:t>
+        <w:t>Checklist</w:t>
       </w:r>
     </w:p>
     <w:p>
@@ -409,7 +375,7 @@
         <w:pStyle w:val="ListBullet"/>
       </w:pPr>
       <w:r>
-        <w:t>Canvas: 8.5in x 11in at 300 ppi (2550 x 3300 px), RGB colour.</w:t>
+        <w:t>8.5" x 11" at 300 ppi, in colour.</w:t>
       </w:r>
     </w:p>
     <w:p>
@@ -417,7 +383,7 @@
         <w:pStyle w:val="ListBullet"/>
       </w:pPr>
       <w:r>
-        <w:t>Downloaded fonts used: Manrope (masthead, selling line, bar) and Roboto (cover lines).</w:t>
+        <w:t>Downloaded fonts: Manrope and Roboto.</w:t>
       </w:r>
     </w:p>
     <w:p>
@@ -425,7 +391,7 @@
         <w:pStyle w:val="ListBullet"/>
       </w:pPr>
       <w:r>
-        <w:t>Industry-standard format: masthead, selling line, main cover line, three additional cover lines, dateline with name, barcode.</w:t>
+        <w:t>Masthead, selling line, main cover line, three more cover lines, dateline with my name, and a barcode.</w:t>
       </w:r>
     </w:p>
     <w:p>
@@ -433,7 +399,7 @@
         <w:pStyle w:val="ListBullet"/>
       </w:pPr>
       <w:r>
-        <w:t>Layers: 18 layers in 7 named groups, including a hidden "BEFORE" layer that can be switched on to show the original mouth.</w:t>
+        <w:t>Layers organised into named folders.</w:t>
       </w:r>
     </w:p>
     <w:p>
@@ -441,7 +407,7 @@
         <w:pStyle w:val="ListBullet"/>
       </w:pPr>
       <w:r>
-        <w:t>Selection tools: Magic Wand / flood-select on the backdrop, lasso around the mouth area before healing.</w:t>
+        <w:t>Selection tool: Lasso. Editing tools: Clone Stamp, Spot Healing Brush, resizing.</w:t>
       </w:r>
     </w:p>
     <w:p>
@@ -449,7 +415,7 @@
         <w:pStyle w:val="ListBullet"/>
       </w:pPr>
       <w:r>
-        <w:t>Editing tools: Clone Stamp, Healing Brush, crop, transform and scale.</w:t>
+        <w:t>Colour tools: Curves and Gradient Map adjustment layers.</w:t>
       </w:r>
     </w:p>
     <w:p>
@@ -457,7 +423,7 @@
         <w:pStyle w:val="ListBullet"/>
       </w:pPr>
       <w:r>
-        <w:t>Colourisation tools: Curves and Gradient Map adjustment layers.</w:t>
+        <w:t>New skill learned on my own: the Displace filter.</w:t>
       </w:r>
     </w:p>
     <w:sectPr>

</xml_diff>

<commit_message>
Explain how each element and principle is used on the cover
Teacher feedback on a previous assignment asked for the elements and
principles to be described - how they were used - rather than listed.
Each entry now says where it appears on the cover, how it was done, and
what it does for the message.

Co-Authored-By: Claude Opus 5.5 <noreply@anthropic.com>
Claude-Session: https://claude.ai/code/session_01MJBkono5h2ZQhPNMyZWo68
</commit_message>
<xml_diff>
--- a/out/PROMPT_planning_sheet.docx
+++ b/out/PROMPT_planning_sheet.docx
@@ -231,6 +231,14 @@
       </w:r>
     </w:p>
     <w:p>
+      <w:r>
+        <w:rPr>
+          <w:i/>
+        </w:rPr>
+        <w:t>For each one: where it is on my cover, how I used it, and why.</w:t>
+      </w:r>
+    </w:p>
+    <w:p>
       <w:pPr>
         <w:spacing w:before="280"/>
       </w:pPr>
@@ -247,7 +255,13 @@
         <w:pStyle w:val="ListBullet"/>
       </w:pPr>
       <w:r>
-        <w:t>Line - the green line under the title, and the lines between the words in the bar.</w:t>
+        <w:rPr>
+          <w:b/>
+        </w:rPr>
+        <w:t xml:space="preserve">Line - </w:t>
+      </w:r>
+      <w:r>
+        <w:t>I put a thin green line right under the PROMPT title to separate the title from the photo. There are also two thin grey lines inside the keyboard bar that split it into three boxes, the same as a real phone keyboard, so people recognise it straight away.</w:t>
       </w:r>
     </w:p>
     <w:p>
@@ -255,7 +269,13 @@
         <w:pStyle w:val="ListBullet"/>
       </w:pPr>
       <w:r>
-        <w:t>Shape - the rounded rectangle bar and the barcode.</w:t>
+        <w:rPr>
+          <w:b/>
+        </w:rPr>
+        <w:t xml:space="preserve">Shape - </w:t>
+      </w:r>
+      <w:r>
+        <w:t>The suggestion bar is a long rounded rectangle, the same shape as the one on a phone, so it looks like real technology. It goes straight across her face where her mouth should be, so its flat, straight shape cuts across the round shape of her face and stands out.</w:t>
       </w:r>
     </w:p>
     <w:p>
@@ -263,7 +283,13 @@
         <w:pStyle w:val="ListBullet"/>
       </w:pPr>
       <w:r>
-        <w:t>Value - a bright face on a very dark background.</w:t>
+        <w:rPr>
+          <w:b/>
+        </w:rPr>
+        <w:t xml:space="preserve">Value - </w:t>
+      </w:r>
+      <w:r>
+        <w:t>I used a Curves adjustment layer to make the background almost black while keeping her face bright. The big difference between light and dark makes her face the brightest thing on the page, so it is the first thing you look at. The dark background also makes the white text easy to read. I also darkened the edges with a Vignette layer so the light stays in the middle.</w:t>
       </w:r>
     </w:p>
     <w:p>
@@ -271,7 +297,13 @@
         <w:pStyle w:val="ListBullet"/>
       </w:pPr>
       <w:r>
-        <w:t>Colour - dark blue with one bright green.</w:t>
+        <w:rPr>
+          <w:b/>
+        </w:rPr>
+        <w:t xml:space="preserve">Colour - </w:t>
+      </w:r>
+      <w:r>
+        <w:t>Most of the cover is dark blue from the Gradient Map, which feels cold and robotic, like technology. The only bright colour is green, and I only used it on the important parts: the selected word "fine", the small headings, the line under the title, and "SENTENCE." Because it is the only bright colour, the green shows you where to look.</w:t>
       </w:r>
     </w:p>
     <w:p>
@@ -279,7 +311,13 @@
         <w:pStyle w:val="ListBullet"/>
       </w:pPr>
       <w:r>
-        <w:t>Texture - the skin texture on her face.</w:t>
+        <w:rPr>
+          <w:b/>
+        </w:rPr>
+        <w:t xml:space="preserve">Texture - </w:t>
+      </w:r>
+      <w:r>
+        <w:t>I kept the real skin texture on her face, like the pores and small lines, so she looks like a real person and not a drawing. When I removed her mouth, I cleaned it up with the Spot Healing Brush so the skin texture there matches the rest of her face. If that spot was smooth and blurry, the edit would look fake.</w:t>
       </w:r>
     </w:p>
     <w:p>
@@ -287,7 +325,13 @@
         <w:pStyle w:val="ListBullet"/>
       </w:pPr>
       <w:r>
-        <w:t>Space - empty dark space on each side of her head for the cover lines.</w:t>
+        <w:rPr>
+          <w:b/>
+        </w:rPr>
+        <w:t xml:space="preserve">Space - </w:t>
+      </w:r>
+      <w:r>
+        <w:t>I left empty dark space on both sides of her head and put my three smaller cover lines there, so the text never covers her face. The empty space also makes the cover feel quiet and a bit lonely, which fits the idea of someone who has lost their voice.</w:t>
       </w:r>
     </w:p>
     <w:p>
@@ -295,7 +339,13 @@
         <w:pStyle w:val="ListBullet"/>
       </w:pPr>
       <w:r>
-        <w:t>Form - her face still looks 3D because of the shadows.</w:t>
+        <w:rPr>
+          <w:b/>
+        </w:rPr>
+        <w:t xml:space="preserve">Form - </w:t>
+      </w:r>
+      <w:r>
+        <w:t>The shadows on her nose, cheeks and jaw make her face look 3D and real. The keyboard bar is completely flat, so it looks like something stuck onto her, which shows that the technology does not belong there.</w:t>
       </w:r>
     </w:p>
     <w:p>
@@ -315,7 +365,13 @@
         <w:pStyle w:val="ListBullet"/>
       </w:pPr>
       <w:r>
-        <w:t>Balance - her face is in the centre, with text on both sides.</w:t>
+        <w:rPr>
+          <w:b/>
+        </w:rPr>
+        <w:t xml:space="preserve">Balance - </w:t>
+      </w:r>
+      <w:r>
+        <w:t>Her face is right in the centre and the title is centred at the top, so the cover is balanced from left to right. I balanced the text around her too: two cover lines on the left and one on the right, and the big main cover line at the bottom left with the barcode at the bottom right.</w:t>
       </w:r>
     </w:p>
     <w:p>
@@ -323,7 +379,13 @@
         <w:pStyle w:val="ListBullet"/>
       </w:pPr>
       <w:r>
-        <w:t>Contrast - bright face against a dark background, and green against blue.</w:t>
+        <w:rPr>
+          <w:b/>
+        </w:rPr>
+        <w:t xml:space="preserve">Contrast - </w:t>
+      </w:r>
+      <w:r>
+        <w:t>I used contrast in three ways: a bright face against a dark background, bright green against dark blue, and a huge heavy title against the small thin selling line above it. The strongest contrast is the light bar and green box on the darker part of her face, so that is what gets noticed first.</w:t>
       </w:r>
     </w:p>
     <w:p>
@@ -331,7 +393,13 @@
         <w:pStyle w:val="ListBullet"/>
       </w:pPr>
       <w:r>
-        <w:t>Emphasis - the green bar in the middle is the first thing you notice.</w:t>
+        <w:rPr>
+          <w:b/>
+        </w:rPr>
+        <w:t xml:space="preserve">Emphasis - </w:t>
+      </w:r>
+      <w:r>
+        <w:t>The keyboard bar is the focal point. It is in the middle of the page, it has the only bright green box, and it is where her mouth should be, which looks strange and makes you look twice. That is on purpose, because the bar is my main message.</w:t>
       </w:r>
     </w:p>
     <w:p>
@@ -339,7 +407,13 @@
         <w:pStyle w:val="ListBullet"/>
       </w:pPr>
       <w:r>
-        <w:t>Movement - your eye goes from the title, down her face, to the bar, then to "FINISH MY SENTENCE."</w:t>
+        <w:rPr>
+          <w:b/>
+        </w:rPr>
+        <w:t xml:space="preserve">Movement - </w:t>
+      </w:r>
+      <w:r>
+        <w:t>Your eye starts at PROMPT at the top, moves down her face to her eyes, then to the bar, then down to "FINISH MY SENTENCE." at the bottom. The green on the title line, the bar and "SENTENCE." works like stepping stones that lead your eye down the page.</w:t>
       </w:r>
     </w:p>
     <w:p>
@@ -347,7 +421,13 @@
         <w:pStyle w:val="ListBullet"/>
       </w:pPr>
       <w:r>
-        <w:t>Repetition - I used the same green on the small headings, the line, the bar and "SENTENCE."</w:t>
+        <w:rPr>
+          <w:b/>
+        </w:rPr>
+        <w:t xml:space="preserve">Repetition - </w:t>
+      </w:r>
+      <w:r>
+        <w:t>I repeated the same green four times. I also set up all three small cover lines the exact same way: a small green word on top and bold white text underneath. Repeating things like a real magazine does makes the cover look planned and professional.</w:t>
       </w:r>
     </w:p>
     <w:p>
@@ -355,7 +435,13 @@
         <w:pStyle w:val="ListBullet"/>
       </w:pPr>
       <w:r>
-        <w:t>Unity - I only used two fonts and the same colours everywhere.</w:t>
+        <w:rPr>
+          <w:b/>
+        </w:rPr>
+        <w:t xml:space="preserve">Unity - </w:t>
+      </w:r>
+      <w:r>
+        <w:t>I only used two fonts, Manrope and Roboto, and the same few colours everywhere. Turning the photo dark blue made it match the dark background, so the photo and the text look like one design instead of separate pieces put together.</w:t>
       </w:r>
     </w:p>
     <w:p>
@@ -363,7 +449,13 @@
         <w:pStyle w:val="ListBullet"/>
       </w:pPr>
       <w:r>
-        <w:t>Rhythm - the three small cover lines are all set up the same way.</w:t>
+        <w:rPr>
+          <w:b/>
+        </w:rPr>
+        <w:t xml:space="preserve">Rhythm - </w:t>
+      </w:r>
+      <w:r>
+        <w:t>The three small cover lines follow the same pattern (green heading, then three short lines of white text) and are spaced out down the sides. Seeing the same pattern again and again gives the cover a steady beat as you read it.</w:t>
       </w:r>
     </w:p>
     <w:p>

</xml_diff>